<commit_message>
fixed repetition in committee bug
</commit_message>
<xml_diff>
--- a/tests/outputs/test_reso.docx
+++ b/tests/outputs/test_reso.docx
@@ -105,7 +105,7 @@
           <w:sz w:val="24"/>
           <w:u w:val="none"/>
         </w:rPr>
-        <w:t>The United Nations General Assembly,</w:t>
+        <w:t>The United Nations General Assembly (unga),</w:t>
       </w:r>
     </w:p>
     <w:p>
@@ -190,11 +190,11 @@
       <w:r>
         <w:rPr>
           <w:b w:val="0"/>
-          <w:i w:val="0"/>
+          <w:i/>
           <w:sz w:val="24"/>
           <w:u w:val="single"/>
         </w:rPr>
-        <w:t xml:space="preserve">Urges </w:t>
+        <w:t>Urges</w:t>
       </w:r>
       <w:r>
         <w:rPr>
@@ -203,7 +203,7 @@
           <w:sz w:val="24"/>
           <w:u w:val="none"/>
         </w:rPr>
-        <w:t>all member states to implement the Paris Agreement commitment through:</w:t>
+        <w:t xml:space="preserve"> all member states to implement the Paris Agreement commitment through:</w:t>
       </w:r>
     </w:p>
     <w:p>
@@ -319,11 +319,11 @@
       <w:r>
         <w:rPr>
           <w:b w:val="0"/>
-          <w:i w:val="0"/>
+          <w:i/>
           <w:sz w:val="24"/>
           <w:u w:val="single"/>
         </w:rPr>
-        <w:t xml:space="preserve">Calls upon </w:t>
+        <w:t>Calls upon</w:t>
       </w:r>
       <w:r>
         <w:rPr>
@@ -332,7 +332,7 @@
           <w:sz w:val="24"/>
           <w:u w:val="none"/>
         </w:rPr>
-        <w:t>developed nations to fulfill their financial obligations by:</w:t>
+        <w:t xml:space="preserve"> developed nations to fulfill their financial obligations by:</w:t>
       </w:r>
     </w:p>
     <w:p>
@@ -448,11 +448,11 @@
       <w:r>
         <w:rPr>
           <w:b w:val="0"/>
-          <w:i w:val="0"/>
+          <w:i/>
           <w:sz w:val="24"/>
           <w:u w:val="single"/>
         </w:rPr>
-        <w:t xml:space="preserve">Recommends </w:t>
+        <w:t>Recommends</w:t>
       </w:r>
       <w:r>
         <w:rPr>
@@ -461,7 +461,7 @@
           <w:sz w:val="24"/>
           <w:u w:val="none"/>
         </w:rPr>
-        <w:t>the establishment of an International Climate Education Initiative to:</w:t>
+        <w:t xml:space="preserve"> the establishment of an International Climate Education Initiative to:</w:t>
       </w:r>
     </w:p>
     <w:p>

</xml_diff>